<commit_message>
Buch: Blumenthal 1999 für Kapitel 2 & 3 ergänzt
Co-Authored-By: Claude Opus 5.5 (1M context) <noreply@anthropic.com>
Claude-Session: https://claude.ai/code/session_01HzbwPnwsHach1SNF1yX4mu
</commit_message>
<xml_diff>
--- a/Quellen/Anhänge/Buch/Auswahl-Studien-und-Erinnerungen.docx
+++ b/Quellen/Anhänge/Buch/Auswahl-Studien-und-Erinnerungen.docx
@@ -21,6 +21,20 @@
       </w:pPr>
       <w:r>
         <w:t>Ausgewählte Studien</w:t>
+      </w:r>
+    </w:p>
+    <w:p>
+      <w:pPr>
+        <w:pStyle w:val="ListBullet"/>
+      </w:pPr>
+      <w:r>
+        <w:rPr>
+          <w:b/>
+        </w:rPr>
+        <w:t xml:space="preserve">Kapitel 2 &amp; 3 – Tiefpunkt und erster Lauf: </w:t>
+      </w:r>
+      <w:r>
+        <w:t>Blumenthal et al. (1999): Bei Menschen mit Depressionen wirkte ein 16-wöchiges Sportprogramm ähnlich gut wie ein Antidepressivum. Vorsichtig formulieren: Sport ersetzt keine Behandlung.</w:t>
       </w:r>
     </w:p>
     <w:p>

</xml_diff>